<commit_message>
Prompt coach live test: plant 3 known mismatches in FR-2 fixtures
Co-Authored-By: Claude Sonnet 5.5 <noreply@anthropic.com>
Claude-Session: https://claude.ai/code/session_01Tyv1UwQ3np1bkFWyjmdiGe
</commit_message>
<xml_diff>
--- a/prompt-coach/research/live-tests/fixtures/fr_revenue_footnote.docx
+++ b/prompt-coach/research/live-tests/fixtures/fr_revenue_footnote.docx
@@ -18,6 +18,11 @@
     <w:p>
       <w:r>
         <w:t xml:space="preserve">Deferred revenue was $140 at quarter end.</w:t>
+      </w:r>
+    </w:p>
+    <w:p>
+      <w:r>
+        <w:t xml:space="preserve">Accounts receivable from contracts with customers was $303 at quarter end.</w:t>
       </w:r>
     </w:p>
   </w:body>

</xml_diff>